<commit_message>
Read GEMINI_API_KEY from Streamlit secrets for cloud deployment
Streamlit Community Cloud has no API_KEY.env file, so live evaluation failed
after deployment. The key loader now falls back to st.secrets when no local
key file is present, without raising outside a Streamlit runtime; local files
still take precedence. The operation guide documents the new source.

🤖 Generated with Codebuff
Co-Authored-By: Codebuff <noreply@codebuff.com>
</commit_message>
<xml_diff>
--- a/Website_Operation_Guide.docx
+++ b/Website_Operation_Guide.docx
@@ -136,6 +136,9 @@
           <w:i w:val="0"/>
         </w:rPr>
         <w:t>The API key is only needed for live evaluation and for generating the experiment results. Everything else - compression, all offline metrics, the charts - runs without it.</w:t>
+      </w:r>
+      <w:r>
+        <w:t xml:space="preserve"> On Streamlit Community Cloud the key is supplied through the app's Settings &gt; Secrets tab instead of a file - see 9.2.</w:t>
       </w:r>
     </w:p>
     <w:p>
@@ -4013,7 +4016,7 @@
           </w:tcPr>
           <w:p>
             <w:r>
-              <w:t>-</w:t>
+              <w:t>API_KEY.env, .env, or st.secrets</w:t>
             </w:r>
           </w:p>
         </w:tc>
@@ -4023,7 +4026,7 @@
           </w:tcPr>
           <w:p>
             <w:r>
-              <w:t>API key; normally stored in API_KEY.env instead.</w:t>
+              <w:t>API key. Local files win; on Streamlit Cloud set it in Settings &gt; Secrets as GEMINI_API_KEY = "...".</w:t>
             </w:r>
           </w:p>
         </w:tc>
@@ -4220,6 +4223,38 @@
           </w:p>
         </w:tc>
       </w:tr>
+      <w:tr>
+        <w:tc>
+          <w:tcPr>
+            <w:tcW w:type="dxa" w:w="2880"/>
+          </w:tcPr>
+          <w:p>
+            <w:r>
+              <w:t>.streamlit/secrets.toml</w:t>
+            </w:r>
+          </w:p>
+        </w:tc>
+        <w:tc>
+          <w:tcPr>
+            <w:tcW w:type="dxa" w:w="2880"/>
+          </w:tcPr>
+          <w:p>
+            <w:r>
+              <w:t>-</w:t>
+            </w:r>
+          </w:p>
+        </w:tc>
+        <w:tc>
+          <w:tcPr>
+            <w:tcW w:type="dxa" w:w="2880"/>
+          </w:tcPr>
+          <w:p>
+            <w:r>
+              <w:t>Alternative to API_KEY.env: GEMINI_API_KEY = "...". Read via st.secrets when no local key file is present.</w:t>
+            </w:r>
+          </w:p>
+        </w:tc>
+      </w:tr>
     </w:tbl>
     <w:p>
       <w:pPr>
@@ -4340,7 +4375,7 @@
           </w:tcPr>
           <w:p>
             <w:r>
-              <w:t>Put the key in API_KEY.env in the project folder and restart Streamlit.</w:t>
+              <w:t>Put the key in API_KEY.env in the project folder, or (when deployed) in Streamlit Settings &gt; Secrets, then restart.</w:t>
             </w:r>
           </w:p>
         </w:tc>

</xml_diff>